<commit_message>
Improve Markdown heading and inline code formatting
</commit_message>
<xml_diff>
--- a/skills/markdown-docx/assets/reference-public.docx
+++ b/skills/markdown-docx/assets/reference-public.docx
@@ -1485,6 +1485,18 @@
       <w:b w:val="0"/>
       <w:color w:val="000000"/>
       <w:sz w:val="19"/>
+    </w:rPr>
+  </w:style>
+  <w:style w:type="character" w:customStyle="1" w:styleId="InlineCodeEmphasis">
+    <w:name w:val="Inline Code Emphasis"/>
+    <w:basedOn w:val="ad"/>
+    <w:rPr>
+      <w:rFonts w:ascii="楷体" w:eastAsia="楷体" w:hAnsi="楷体" w:cs="楷体"/>
+      <w:b w:val="1"/>
+      <w:bCs w:val="1"/>
+      <w:color w:val="000000"/>
+      <w:sz w:val="24"/>
+      <w:szCs w:val="24"/>
     </w:rPr>
   </w:style>
   <w:style w:type="character" w:customStyle="1" w:styleId="SectionNumber">

</xml_diff>

<commit_message>
Improve Markdown heading and inline code formatting (#4)
</commit_message>
<xml_diff>
--- a/skills/markdown-docx/assets/reference-public.docx
+++ b/skills/markdown-docx/assets/reference-public.docx
@@ -1485,6 +1485,18 @@
       <w:b w:val="0"/>
       <w:color w:val="000000"/>
       <w:sz w:val="19"/>
+    </w:rPr>
+  </w:style>
+  <w:style w:type="character" w:customStyle="1" w:styleId="InlineCodeEmphasis">
+    <w:name w:val="Inline Code Emphasis"/>
+    <w:basedOn w:val="ad"/>
+    <w:rPr>
+      <w:rFonts w:ascii="楷体" w:eastAsia="楷体" w:hAnsi="楷体" w:cs="楷体"/>
+      <w:b w:val="1"/>
+      <w:bCs w:val="1"/>
+      <w:color w:val="000000"/>
+      <w:sz w:val="24"/>
+      <w:szCs w:val="24"/>
     </w:rPr>
   </w:style>
   <w:style w:type="character" w:customStyle="1" w:styleId="SectionNumber">

</xml_diff>

<commit_message>
Style text code blocks in Markdown DOCX
</commit_message>
<xml_diff>
--- a/skills/markdown-docx/assets/reference-public.docx
+++ b/skills/markdown-docx/assets/reference-public.docx
@@ -1485,6 +1485,18 @@
       <w:b w:val="0"/>
       <w:color w:val="000000"/>
       <w:sz w:val="19"/>
+    </w:rPr>
+  </w:style>
+  <w:style w:type="character" w:customStyle="1" w:styleId="TextCodeBlock">
+    <w:name w:val="Text Code Block"/>
+    <w:basedOn w:val="ad"/>
+    <w:rPr>
+      <w:rFonts w:ascii="楷体" w:eastAsia="楷体" w:hAnsi="楷体" w:cs="楷体"/>
+      <w:b w:val="0"/>
+      <w:bCs w:val="0"/>
+      <w:color w:val="000000"/>
+      <w:sz w:val="20"/>
+      <w:szCs w:val="20"/>
     </w:rPr>
   </w:style>
   <w:style w:type="character" w:customStyle="1" w:styleId="InlineCodeEmphasis">

</xml_diff>

<commit_message>
Style text code blocks in Markdown DOCX (#5)
</commit_message>
<xml_diff>
--- a/skills/markdown-docx/assets/reference-public.docx
+++ b/skills/markdown-docx/assets/reference-public.docx
@@ -1485,6 +1485,18 @@
       <w:b w:val="0"/>
       <w:color w:val="000000"/>
       <w:sz w:val="19"/>
+    </w:rPr>
+  </w:style>
+  <w:style w:type="character" w:customStyle="1" w:styleId="TextCodeBlock">
+    <w:name w:val="Text Code Block"/>
+    <w:basedOn w:val="ad"/>
+    <w:rPr>
+      <w:rFonts w:ascii="楷体" w:eastAsia="楷体" w:hAnsi="楷体" w:cs="楷体"/>
+      <w:b w:val="0"/>
+      <w:bCs w:val="0"/>
+      <w:color w:val="000000"/>
+      <w:sz w:val="20"/>
+      <w:szCs w:val="20"/>
     </w:rPr>
   </w:style>
   <w:style w:type="character" w:customStyle="1" w:styleId="InlineCodeEmphasis">

</xml_diff>

<commit_message>
Add author explanations and left-aligned document metadata
</commit_message>
<xml_diff>
--- a/skills/markdown-docx/assets/reference-public.docx
+++ b/skills/markdown-docx/assets/reference-public.docx
@@ -1606,6 +1606,67 @@
       <w:color w:val="000000"/>
       <w:sz w:val="18"/>
       <w:szCs w:val="18"/>
+    </w:rPr>
+  </w:style>
+  <w:style w:type="paragraph" w:customStyle="1" w:styleId="AuthorNote">
+    <w:name w:val="Author Note"/>
+    <w:basedOn w:val="aa"/>
+    <w:next w:val="AuthorNote"/>
+    <w:qFormat/>
+    <w:pPr>
+      <w:spacing w:before="80" w:after="80" w:line="312" w:lineRule="auto"/>
+      <w:ind w:left="425" w:right="142" w:firstLineChars="0" w:firstLine="0"/>
+      <w:jc w:val="left"/>
+    </w:pPr>
+    <w:rPr>
+      <w:rFonts w:ascii="Times New Roman" w:eastAsia="宋体" w:hAnsi="Times New Roman" w:cs="Times New Roman"/>
+      <w:b w:val="0"/>
+      <w:bCs w:val="0"/>
+      <w:color w:val="C00000"/>
+      <w:sz w:val="22"/>
+      <w:szCs w:val="22"/>
+    </w:rPr>
+  </w:style>
+  <w:style w:type="character" w:customStyle="1" w:styleId="AuthorNoteText">
+    <w:name w:val="Author Note Text"/>
+    <w:basedOn w:val="a1"/>
+    <w:rPr>
+      <w:rFonts w:ascii="Times New Roman" w:eastAsia="宋体" w:hAnsi="Times New Roman" w:cs="Times New Roman"/>
+      <w:b w:val="0"/>
+      <w:bCs w:val="0"/>
+      <w:color w:val="C00000"/>
+      <w:sz w:val="22"/>
+      <w:szCs w:val="22"/>
+    </w:rPr>
+  </w:style>
+  <w:style w:type="paragraph" w:customStyle="1" w:styleId="DocMeta">
+    <w:name w:val="Doc Meta"/>
+    <w:basedOn w:val="a0"/>
+    <w:next w:val="DocMeta"/>
+    <w:qFormat/>
+    <w:pPr>
+      <w:ind w:firstLineChars="0" w:firstLine="0"/>
+      <w:jc w:val="left"/>
+    </w:pPr>
+    <w:rPr>
+      <w:rFonts w:ascii="Times New Roman" w:eastAsia="宋体" w:hAnsi="Times New Roman" w:cs="Times New Roman"/>
+      <w:b w:val="0"/>
+      <w:bCs w:val="0"/>
+      <w:color w:val="000000"/>
+      <w:sz w:val="24"/>
+      <w:szCs w:val="24"/>
+    </w:rPr>
+  </w:style>
+  <w:style w:type="character" w:customStyle="1" w:styleId="DocMetaText">
+    <w:name w:val="Doc Meta Text"/>
+    <w:basedOn w:val="a1"/>
+    <w:rPr>
+      <w:rFonts w:ascii="Times New Roman" w:eastAsia="宋体" w:hAnsi="Times New Roman" w:cs="Times New Roman"/>
+      <w:b w:val="0"/>
+      <w:bCs w:val="0"/>
+      <w:color w:val="000000"/>
+      <w:sz w:val="24"/>
+      <w:szCs w:val="24"/>
     </w:rPr>
   </w:style>
 </w:styles>

</xml_diff>

<commit_message>
Add author explanations and left-aligned document metadata (#12)
</commit_message>
<xml_diff>
--- a/skills/markdown-docx/assets/reference-public.docx
+++ b/skills/markdown-docx/assets/reference-public.docx
@@ -1606,6 +1606,67 @@
       <w:color w:val="000000"/>
       <w:sz w:val="18"/>
       <w:szCs w:val="18"/>
+    </w:rPr>
+  </w:style>
+  <w:style w:type="paragraph" w:customStyle="1" w:styleId="AuthorNote">
+    <w:name w:val="Author Note"/>
+    <w:basedOn w:val="aa"/>
+    <w:next w:val="AuthorNote"/>
+    <w:qFormat/>
+    <w:pPr>
+      <w:spacing w:before="80" w:after="80" w:line="312" w:lineRule="auto"/>
+      <w:ind w:left="425" w:right="142" w:firstLineChars="0" w:firstLine="0"/>
+      <w:jc w:val="left"/>
+    </w:pPr>
+    <w:rPr>
+      <w:rFonts w:ascii="Times New Roman" w:eastAsia="宋体" w:hAnsi="Times New Roman" w:cs="Times New Roman"/>
+      <w:b w:val="0"/>
+      <w:bCs w:val="0"/>
+      <w:color w:val="C00000"/>
+      <w:sz w:val="22"/>
+      <w:szCs w:val="22"/>
+    </w:rPr>
+  </w:style>
+  <w:style w:type="character" w:customStyle="1" w:styleId="AuthorNoteText">
+    <w:name w:val="Author Note Text"/>
+    <w:basedOn w:val="a1"/>
+    <w:rPr>
+      <w:rFonts w:ascii="Times New Roman" w:eastAsia="宋体" w:hAnsi="Times New Roman" w:cs="Times New Roman"/>
+      <w:b w:val="0"/>
+      <w:bCs w:val="0"/>
+      <w:color w:val="C00000"/>
+      <w:sz w:val="22"/>
+      <w:szCs w:val="22"/>
+    </w:rPr>
+  </w:style>
+  <w:style w:type="paragraph" w:customStyle="1" w:styleId="DocMeta">
+    <w:name w:val="Doc Meta"/>
+    <w:basedOn w:val="a0"/>
+    <w:next w:val="DocMeta"/>
+    <w:qFormat/>
+    <w:pPr>
+      <w:ind w:firstLineChars="0" w:firstLine="0"/>
+      <w:jc w:val="left"/>
+    </w:pPr>
+    <w:rPr>
+      <w:rFonts w:ascii="Times New Roman" w:eastAsia="宋体" w:hAnsi="Times New Roman" w:cs="Times New Roman"/>
+      <w:b w:val="0"/>
+      <w:bCs w:val="0"/>
+      <w:color w:val="000000"/>
+      <w:sz w:val="24"/>
+      <w:szCs w:val="24"/>
+    </w:rPr>
+  </w:style>
+  <w:style w:type="character" w:customStyle="1" w:styleId="DocMetaText">
+    <w:name w:val="Doc Meta Text"/>
+    <w:basedOn w:val="a1"/>
+    <w:rPr>
+      <w:rFonts w:ascii="Times New Roman" w:eastAsia="宋体" w:hAnsi="Times New Roman" w:cs="Times New Roman"/>
+      <w:b w:val="0"/>
+      <w:bCs w:val="0"/>
+      <w:color w:val="000000"/>
+      <w:sz w:val="24"/>
+      <w:szCs w:val="24"/>
     </w:rPr>
   </w:style>
 </w:styles>

</xml_diff>